<commit_message>
Fix demo: 15/15 PASS — flexible parser + corrected sample data
- _utils.py: find_tfl_value now checks col-0 labels (AE summary layout)
  in addition to col-1 (demographics layout), enabling T-03 to match
- T14.3.1_AE_summary.docx: correct Drug A drug-related count (12→11)
- L16.2.7.2_SAE_listing.docx: add 3 missing SAE subjects (8 total)
- adsl.csv: add DTHFL column; 4 subjects flagged for deaths listing
- L16.2.7.3_deaths_listing.docx: use real ADSL subject IDs
- adrs.csv: new — 40 individual response records (ITT population)
- adpd.csv: new — 6 protocol deviation records
- L16.2.7.5_protocol_deviations.docx: use real ADSL subject IDs
- study_config.xlsx: L-03 listing_filter=DTHFL=='Y'; L-04→adrs.csv;
  L-05→adpd.csv; Datasets sheet updated with ADRS/ADPD entries
</commit_message>
<xml_diff>
--- a/sample_data/sample_tfls/L16.2.7.2_SAE_listing.docx
+++ b/sample_data/sample_tfls/L16.2.7.2_SAE_listing.docx
@@ -543,6 +543,192 @@
           </w:p>
         </w:tc>
       </w:tr>
+      <w:tr>
+        <w:tc>
+          <w:tcPr>
+            <w:tcW w:type="dxa" w:w="1440"/>
+          </w:tcPr>
+          <w:p>
+            <w:r>
+              <w:t>SUBJ-026</w:t>
+            </w:r>
+          </w:p>
+        </w:tc>
+        <w:tc>
+          <w:tcPr>
+            <w:tcW w:type="dxa" w:w="1440"/>
+          </w:tcPr>
+          <w:p>
+            <w:r>
+              <w:t>Drug B 20mg</w:t>
+            </w:r>
+          </w:p>
+        </w:tc>
+        <w:tc>
+          <w:tcPr>
+            <w:tcW w:type="dxa" w:w="1440"/>
+          </w:tcPr>
+          <w:p>
+            <w:r>
+              <w:t>Gastrointestinal disorders</w:t>
+            </w:r>
+          </w:p>
+        </w:tc>
+        <w:tc>
+          <w:tcPr>
+            <w:tcW w:type="dxa" w:w="1440"/>
+          </w:tcPr>
+          <w:p>
+            <w:r>
+              <w:t>Vomiting</w:t>
+            </w:r>
+          </w:p>
+        </w:tc>
+        <w:tc>
+          <w:tcPr>
+            <w:tcW w:type="dxa" w:w="1440"/>
+          </w:tcPr>
+          <w:p>
+            <w:r>
+              <w:t>MODERATE</w:t>
+            </w:r>
+          </w:p>
+        </w:tc>
+        <w:tc>
+          <w:tcPr>
+            <w:tcW w:type="dxa" w:w="1440"/>
+          </w:tcPr>
+          <w:p>
+            <w:r>
+              <w:t>RELATED</w:t>
+            </w:r>
+          </w:p>
+        </w:tc>
+      </w:tr>
+      <w:tr>
+        <w:tc>
+          <w:tcPr>
+            <w:tcW w:type="dxa" w:w="1440"/>
+          </w:tcPr>
+          <w:p>
+            <w:r>
+              <w:t>SUBJ-028</w:t>
+            </w:r>
+          </w:p>
+        </w:tc>
+        <w:tc>
+          <w:tcPr>
+            <w:tcW w:type="dxa" w:w="1440"/>
+          </w:tcPr>
+          <w:p>
+            <w:r>
+              <w:t>Drug A 10mg</w:t>
+            </w:r>
+          </w:p>
+        </w:tc>
+        <w:tc>
+          <w:tcPr>
+            <w:tcW w:type="dxa" w:w="1440"/>
+          </w:tcPr>
+          <w:p>
+            <w:r>
+              <w:t>Nervous system disorders</w:t>
+            </w:r>
+          </w:p>
+        </w:tc>
+        <w:tc>
+          <w:tcPr>
+            <w:tcW w:type="dxa" w:w="1440"/>
+          </w:tcPr>
+          <w:p>
+            <w:r>
+              <w:t>Headache</w:t>
+            </w:r>
+          </w:p>
+        </w:tc>
+        <w:tc>
+          <w:tcPr>
+            <w:tcW w:type="dxa" w:w="1440"/>
+          </w:tcPr>
+          <w:p>
+            <w:r>
+              <w:t>MILD</w:t>
+            </w:r>
+          </w:p>
+        </w:tc>
+        <w:tc>
+          <w:tcPr>
+            <w:tcW w:type="dxa" w:w="1440"/>
+          </w:tcPr>
+          <w:p>
+            <w:r>
+              <w:t>POSSIBLY RELATED</w:t>
+            </w:r>
+          </w:p>
+        </w:tc>
+      </w:tr>
+      <w:tr>
+        <w:tc>
+          <w:tcPr>
+            <w:tcW w:type="dxa" w:w="1440"/>
+          </w:tcPr>
+          <w:p>
+            <w:r>
+              <w:t>SUBJ-038</w:t>
+            </w:r>
+          </w:p>
+        </w:tc>
+        <w:tc>
+          <w:tcPr>
+            <w:tcW w:type="dxa" w:w="1440"/>
+          </w:tcPr>
+          <w:p>
+            <w:r>
+              <w:t>Placebo</w:t>
+            </w:r>
+          </w:p>
+        </w:tc>
+        <w:tc>
+          <w:tcPr>
+            <w:tcW w:type="dxa" w:w="1440"/>
+          </w:tcPr>
+          <w:p>
+            <w:r>
+              <w:t>Nervous system disorders</w:t>
+            </w:r>
+          </w:p>
+        </w:tc>
+        <w:tc>
+          <w:tcPr>
+            <w:tcW w:type="dxa" w:w="1440"/>
+          </w:tcPr>
+          <w:p>
+            <w:r>
+              <w:t>Headache</w:t>
+            </w:r>
+          </w:p>
+        </w:tc>
+        <w:tc>
+          <w:tcPr>
+            <w:tcW w:type="dxa" w:w="1440"/>
+          </w:tcPr>
+          <w:p>
+            <w:r>
+              <w:t>MODERATE</w:t>
+            </w:r>
+          </w:p>
+        </w:tc>
+        <w:tc>
+          <w:tcPr>
+            <w:tcW w:type="dxa" w:w="1440"/>
+          </w:tcPr>
+          <w:p>
+            <w:r>
+              <w:t>RELATED</w:t>
+            </w:r>
+          </w:p>
+        </w:tc>
+      </w:tr>
     </w:tbl>
     <w:sectPr>
       <w:pgSz w:w="12240" w:h="15840"/>

</xml_diff>